<commit_message>
Style rolodex return button; clean up people docx and stale log
- Restyle rolodex return nav as pill button with localized label, add bottom back link
- Remove stale docx files for individuals with dedicated pages
- Update Xiao Jialin docx
- Remove committed slack_mcp.log
</commit_message>
<xml_diff>
--- a/people/萧家霖.docx
+++ b/people/萧家霖.docx
@@ -45,11 +45,33 @@
         <w:ind w:left="0" w:rightChars="100" w:right="210" w:firstLineChars="0" w:firstLine="0"/>
         <w:contextualSpacing/>
         <w:rPr>
+          <w:rFonts w:asciiTheme="minorEastAsia" w:hAnsiTheme="minorEastAsia" w:cs="Tahoma"/>
+          <w:color w:val="444444"/>
+          <w:sz w:val="22"/>
+          <w:szCs w:val="22"/>
+        </w:rPr>
+      </w:pPr>
+      <w:r>
+        <w:rPr>
           <w:rFonts w:asciiTheme="minorEastAsia" w:hAnsiTheme="minorEastAsia" w:cs="Tahoma" w:hint="eastAsia"/>
           <w:color w:val="444444"/>
           <w:sz w:val="22"/>
           <w:szCs w:val="22"/>
         </w:rPr>
+        <w:t>字筱村，号迪忱，江西奉新县赤田乡桃树行政村九陇萧村人</w:t>
+      </w:r>
+    </w:p>
+    <w:p>
+      <w:pPr>
+        <w:spacing w:before="0" w:beforeAutospacing="0"/>
+        <w:ind w:left="0" w:rightChars="100" w:right="210" w:firstLineChars="0" w:firstLine="0"/>
+        <w:contextualSpacing/>
+        <w:rPr>
+          <w:rFonts w:asciiTheme="minorEastAsia" w:hAnsiTheme="minorEastAsia" w:cs="Tahoma"/>
+          <w:color w:val="444444"/>
+          <w:sz w:val="22"/>
+          <w:szCs w:val="22"/>
+        </w:rPr>
       </w:pPr>
       <w:r>
         <w:rPr>
@@ -58,28 +80,6 @@
           <w:sz w:val="22"/>
           <w:szCs w:val="22"/>
         </w:rPr>
-        <w:t>字筱村，号迪忱，江西奉新县赤田乡桃树行政村九陇萧村人</w:t>
-      </w:r>
-    </w:p>
-    <w:p>
-      <w:pPr>
-        <w:spacing w:before="0" w:beforeAutospacing="0"/>
-        <w:ind w:left="0" w:rightChars="100" w:right="210" w:firstLineChars="0" w:firstLine="0"/>
-        <w:contextualSpacing/>
-        <w:rPr>
-          <w:rFonts w:asciiTheme="minorEastAsia" w:hAnsiTheme="minorEastAsia" w:cs="Tahoma" w:hint="eastAsia"/>
-          <w:color w:val="444444"/>
-          <w:sz w:val="22"/>
-          <w:szCs w:val="22"/>
-        </w:rPr>
-      </w:pPr>
-      <w:r>
-        <w:rPr>
-          <w:rFonts w:asciiTheme="minorEastAsia" w:hAnsiTheme="minorEastAsia" w:cs="Tahoma" w:hint="eastAsia"/>
-          <w:color w:val="444444"/>
-          <w:sz w:val="22"/>
-          <w:szCs w:val="22"/>
-        </w:rPr>
         <w:t>教育家，语言学家，辞书编纂家</w:t>
       </w:r>
     </w:p>
@@ -89,7 +89,7 @@
         <w:ind w:left="0" w:rightChars="100" w:right="210" w:firstLineChars="0" w:firstLine="0"/>
         <w:contextualSpacing/>
         <w:rPr>
-          <w:rFonts w:asciiTheme="minorEastAsia" w:hAnsiTheme="minorEastAsia" w:hint="eastAsia"/>
+          <w:rFonts w:asciiTheme="minorEastAsia" w:hAnsiTheme="minorEastAsia"/>
           <w:sz w:val="18"/>
           <w:szCs w:val="18"/>
         </w:rPr>
@@ -179,12 +179,21 @@
         <w:ind w:left="0" w:rightChars="100" w:right="210" w:firstLineChars="0" w:firstLine="0"/>
         <w:contextualSpacing/>
         <w:rPr>
+          <w:rFonts w:asciiTheme="minorEastAsia" w:hAnsiTheme="minorEastAsia" w:cs="Tahoma"/>
+          <w:color w:val="444444"/>
+          <w:sz w:val="22"/>
+          <w:szCs w:val="22"/>
+        </w:rPr>
+      </w:pPr>
+      <w:r>
+        <w:rPr>
           <w:rFonts w:asciiTheme="minorEastAsia" w:hAnsiTheme="minorEastAsia" w:cs="Tahoma" w:hint="eastAsia"/>
           <w:color w:val="444444"/>
           <w:sz w:val="22"/>
           <w:szCs w:val="22"/>
         </w:rPr>
-      </w:pPr>
+        <w:t>1925年，</w:t>
+      </w:r>
       <w:r>
         <w:rPr>
           <w:rFonts w:asciiTheme="minorEastAsia" w:hAnsiTheme="minorEastAsia" w:cs="Tahoma" w:hint="eastAsia"/>
@@ -192,7 +201,7 @@
           <w:sz w:val="22"/>
           <w:szCs w:val="22"/>
         </w:rPr>
-        <w:t>1925年，</w:t>
+        <w:t>萧家霖</w:t>
       </w:r>
       <w:r>
         <w:rPr>
@@ -201,7 +210,7 @@
           <w:sz w:val="22"/>
           <w:szCs w:val="22"/>
         </w:rPr>
-        <w:t>萧家霖</w:t>
+        <w:t>毕业于国立北京师范大学校国文系</w:t>
       </w:r>
       <w:r>
         <w:rPr>
@@ -210,7 +219,7 @@
           <w:sz w:val="22"/>
           <w:szCs w:val="22"/>
         </w:rPr>
-        <w:t>毕业于国立北京师范大学校国文系</w:t>
+        <w:t>，主修音韵学</w:t>
       </w:r>
       <w:r>
         <w:rPr>
@@ -286,12 +295,21 @@
         <w:ind w:left="0" w:rightChars="100" w:right="210" w:firstLineChars="0" w:firstLine="0"/>
         <w:contextualSpacing/>
         <w:rPr>
+          <w:rFonts w:asciiTheme="minorEastAsia" w:hAnsiTheme="minorEastAsia" w:cs="Tahoma"/>
+          <w:color w:val="444444"/>
+          <w:sz w:val="22"/>
+          <w:szCs w:val="22"/>
+        </w:rPr>
+      </w:pPr>
+      <w:r>
+        <w:rPr>
           <w:rFonts w:asciiTheme="minorEastAsia" w:hAnsiTheme="minorEastAsia" w:cs="Tahoma" w:hint="eastAsia"/>
           <w:color w:val="444444"/>
           <w:sz w:val="22"/>
           <w:szCs w:val="22"/>
         </w:rPr>
-      </w:pPr>
+        <w:t>1919年9月，国语统一筹备会成立</w:t>
+      </w:r>
       <w:r>
         <w:rPr>
           <w:rFonts w:asciiTheme="minorEastAsia" w:hAnsiTheme="minorEastAsia" w:cs="Tahoma" w:hint="eastAsia"/>
@@ -299,7 +317,7 @@
           <w:sz w:val="22"/>
           <w:szCs w:val="22"/>
         </w:rPr>
-        <w:t>1919年9月，国语统一筹备会成立</w:t>
+        <w:t>，</w:t>
       </w:r>
       <w:r>
         <w:rPr>
@@ -308,7 +326,7 @@
           <w:sz w:val="22"/>
           <w:szCs w:val="22"/>
         </w:rPr>
-        <w:t>，</w:t>
+        <w:t>任委员</w:t>
       </w:r>
       <w:r>
         <w:rPr>
@@ -317,8 +335,35 @@
           <w:sz w:val="22"/>
           <w:szCs w:val="22"/>
         </w:rPr>
-        <w:t>任委员</w:t>
-      </w:r>
+        <w:t>。</w:t>
+      </w:r>
+    </w:p>
+    <w:p>
+      <w:pPr>
+        <w:spacing w:before="0" w:beforeAutospacing="0" w:line="240" w:lineRule="auto"/>
+        <w:ind w:left="0" w:rightChars="100" w:right="210" w:firstLineChars="0" w:firstLine="0"/>
+        <w:contextualSpacing/>
+        <w:rPr>
+          <w:rFonts w:asciiTheme="minorEastAsia" w:hAnsiTheme="minorEastAsia" w:cs="Tahoma"/>
+          <w:color w:val="444444"/>
+          <w:sz w:val="22"/>
+          <w:szCs w:val="22"/>
+        </w:rPr>
+      </w:pPr>
+    </w:p>
+    <w:p>
+      <w:pPr>
+        <w:spacing w:before="0" w:beforeAutospacing="0" w:line="240" w:lineRule="auto"/>
+        <w:ind w:left="0" w:rightChars="100" w:right="210" w:firstLineChars="0" w:firstLine="0"/>
+        <w:contextualSpacing/>
+        <w:rPr>
+          <w:rFonts w:asciiTheme="minorEastAsia" w:hAnsiTheme="minorEastAsia"/>
+          <w:color w:val="222222"/>
+          <w:sz w:val="22"/>
+          <w:szCs w:val="22"/>
+          <w:shd w:val="clear" w:color="auto" w:fill="FFFFFF"/>
+        </w:rPr>
+      </w:pPr>
       <w:r>
         <w:rPr>
           <w:rFonts w:asciiTheme="minorEastAsia" w:hAnsiTheme="minorEastAsia" w:cs="Tahoma" w:hint="eastAsia"/>
@@ -326,6 +371,36 @@
           <w:sz w:val="22"/>
           <w:szCs w:val="22"/>
         </w:rPr>
+        <w:t>1929年，曾任</w:t>
+      </w:r>
+      <w:r>
+        <w:rPr>
+          <w:rFonts w:asciiTheme="minorEastAsia" w:hAnsiTheme="minorEastAsia" w:hint="eastAsia"/>
+          <w:color w:val="333333"/>
+          <w:sz w:val="22"/>
+          <w:szCs w:val="22"/>
+          <w:shd w:val="clear" w:color="auto" w:fill="FFFFFF"/>
+        </w:rPr>
+        <w:t>江苏省立东海师范学校</w:t>
+      </w:r>
+      <w:r>
+        <w:rPr>
+          <w:rFonts w:asciiTheme="minorEastAsia" w:hAnsiTheme="minorEastAsia" w:hint="eastAsia"/>
+          <w:color w:val="222222"/>
+          <w:sz w:val="22"/>
+          <w:szCs w:val="22"/>
+          <w:shd w:val="clear" w:color="auto" w:fill="FFFFFF"/>
+        </w:rPr>
+        <w:t>图书馆主任</w:t>
+      </w:r>
+      <w:r>
+        <w:rPr>
+          <w:rFonts w:asciiTheme="minorEastAsia" w:hAnsiTheme="minorEastAsia" w:hint="eastAsia"/>
+          <w:color w:val="222222"/>
+          <w:sz w:val="22"/>
+          <w:szCs w:val="22"/>
+          <w:shd w:val="clear" w:color="auto" w:fill="FFFFFF"/>
+        </w:rPr>
         <w:t>。</w:t>
       </w:r>
     </w:p>
@@ -348,73 +423,7 @@
         <w:ind w:left="0" w:rightChars="100" w:right="210" w:firstLineChars="0" w:firstLine="0"/>
         <w:contextualSpacing/>
         <w:rPr>
-          <w:rFonts w:asciiTheme="minorEastAsia" w:hAnsiTheme="minorEastAsia" w:hint="eastAsia"/>
-          <w:color w:val="222222"/>
-          <w:sz w:val="22"/>
-          <w:szCs w:val="22"/>
-          <w:shd w:val="clear" w:color="auto" w:fill="FFFFFF"/>
-        </w:rPr>
-      </w:pPr>
-      <w:r>
-        <w:rPr>
-          <w:rFonts w:asciiTheme="minorEastAsia" w:hAnsiTheme="minorEastAsia" w:cs="Tahoma" w:hint="eastAsia"/>
-          <w:color w:val="444444"/>
-          <w:sz w:val="22"/>
-          <w:szCs w:val="22"/>
-        </w:rPr>
-        <w:t>1929年，曾任</w:t>
-      </w:r>
-      <w:r>
-        <w:rPr>
-          <w:rFonts w:asciiTheme="minorEastAsia" w:hAnsiTheme="minorEastAsia" w:hint="eastAsia"/>
-          <w:color w:val="333333"/>
-          <w:sz w:val="22"/>
-          <w:szCs w:val="22"/>
-          <w:shd w:val="clear" w:color="auto" w:fill="FFFFFF"/>
-        </w:rPr>
-        <w:t>江苏省立东海师范学校</w:t>
-      </w:r>
-      <w:r>
-        <w:rPr>
-          <w:rFonts w:asciiTheme="minorEastAsia" w:hAnsiTheme="minorEastAsia" w:hint="eastAsia"/>
-          <w:color w:val="222222"/>
-          <w:sz w:val="22"/>
-          <w:szCs w:val="22"/>
-          <w:shd w:val="clear" w:color="auto" w:fill="FFFFFF"/>
-        </w:rPr>
-        <w:t>图书馆主任</w:t>
-      </w:r>
-      <w:r>
-        <w:rPr>
-          <w:rFonts w:asciiTheme="minorEastAsia" w:hAnsiTheme="minorEastAsia" w:hint="eastAsia"/>
-          <w:color w:val="222222"/>
-          <w:sz w:val="22"/>
-          <w:szCs w:val="22"/>
-          <w:shd w:val="clear" w:color="auto" w:fill="FFFFFF"/>
-        </w:rPr>
-        <w:t>。</w:t>
-      </w:r>
-    </w:p>
-    <w:p>
-      <w:pPr>
-        <w:spacing w:before="0" w:beforeAutospacing="0" w:line="240" w:lineRule="auto"/>
-        <w:ind w:left="0" w:rightChars="100" w:right="210" w:firstLineChars="0" w:firstLine="0"/>
-        <w:contextualSpacing/>
-        <w:rPr>
           <w:rFonts w:asciiTheme="minorEastAsia" w:hAnsiTheme="minorEastAsia" w:cs="Tahoma"/>
-          <w:color w:val="444444"/>
-          <w:sz w:val="22"/>
-          <w:szCs w:val="22"/>
-        </w:rPr>
-      </w:pPr>
-    </w:p>
-    <w:p>
-      <w:pPr>
-        <w:spacing w:before="0" w:beforeAutospacing="0" w:line="240" w:lineRule="auto"/>
-        <w:ind w:left="0" w:rightChars="100" w:right="210" w:firstLineChars="0" w:firstLine="0"/>
-        <w:contextualSpacing/>
-        <w:rPr>
-          <w:rFonts w:asciiTheme="minorEastAsia" w:hAnsiTheme="minorEastAsia" w:cs="Tahoma" w:hint="eastAsia"/>
           <w:color w:val="444444"/>
           <w:sz w:val="22"/>
           <w:szCs w:val="22"/>
@@ -496,7 +505,7 @@
         <w:contextualSpacing/>
         <w:rPr>
           <w:rStyle w:val="apple-converted-space"/>
-          <w:rFonts w:asciiTheme="minorEastAsia" w:hAnsiTheme="minorEastAsia" w:cs="Tahoma" w:hint="eastAsia"/>
+          <w:rFonts w:asciiTheme="minorEastAsia" w:hAnsiTheme="minorEastAsia" w:cs="Tahoma"/>
           <w:color w:val="444444"/>
           <w:sz w:val="22"/>
           <w:szCs w:val="22"/>
@@ -594,7 +603,7 @@
         <w:contextualSpacing/>
         <w:rPr>
           <w:rStyle w:val="apple-converted-space"/>
-          <w:rFonts w:asciiTheme="minorEastAsia" w:hAnsiTheme="minorEastAsia" w:cs="Tahoma" w:hint="eastAsia"/>
+          <w:rFonts w:asciiTheme="minorEastAsia" w:hAnsiTheme="minorEastAsia" w:cs="Tahoma"/>
           <w:color w:val="444444"/>
           <w:sz w:val="22"/>
           <w:szCs w:val="22"/>
@@ -692,7 +701,7 @@
         <w:contextualSpacing/>
         <w:rPr>
           <w:rStyle w:val="apple-converted-space"/>
-          <w:rFonts w:asciiTheme="minorEastAsia" w:hAnsiTheme="minorEastAsia" w:cs="Tahoma" w:hint="eastAsia"/>
+          <w:rFonts w:asciiTheme="minorEastAsia" w:hAnsiTheme="minorEastAsia" w:cs="Tahoma"/>
           <w:color w:val="444444"/>
           <w:sz w:val="22"/>
           <w:szCs w:val="22"/>
@@ -759,7 +768,7 @@
         <w:ind w:left="0" w:rightChars="100" w:right="210" w:firstLineChars="0" w:firstLine="0"/>
         <w:contextualSpacing/>
         <w:rPr>
-          <w:rFonts w:asciiTheme="minorEastAsia" w:hAnsiTheme="minorEastAsia" w:hint="eastAsia"/>
+          <w:rFonts w:asciiTheme="minorEastAsia" w:hAnsiTheme="minorEastAsia"/>
           <w:color w:val="222222"/>
           <w:sz w:val="22"/>
           <w:szCs w:val="22"/>
@@ -917,7 +926,7 @@
         <w:ind w:left="0" w:rightChars="100" w:right="210" w:firstLineChars="0" w:firstLine="0"/>
         <w:contextualSpacing/>
         <w:rPr>
-          <w:rFonts w:asciiTheme="minorEastAsia" w:hAnsiTheme="minorEastAsia" w:hint="eastAsia"/>
+          <w:rFonts w:asciiTheme="minorEastAsia" w:hAnsiTheme="minorEastAsia"/>
           <w:color w:val="222222"/>
           <w:sz w:val="22"/>
           <w:szCs w:val="22"/>
@@ -981,7 +990,7 @@
         <w:ind w:left="0" w:rightChars="100" w:right="210" w:firstLineChars="200" w:firstLine="440"/>
         <w:contextualSpacing/>
         <w:rPr>
-          <w:rFonts w:asciiTheme="minorEastAsia" w:hAnsiTheme="minorEastAsia" w:hint="eastAsia"/>
+          <w:rFonts w:asciiTheme="minorEastAsia" w:hAnsiTheme="minorEastAsia"/>
           <w:color w:val="222222"/>
           <w:sz w:val="22"/>
           <w:szCs w:val="22"/>
@@ -1171,7 +1180,7 @@
         <w:ind w:left="0" w:rightChars="100" w:right="210" w:firstLineChars="0" w:firstLine="0"/>
         <w:contextualSpacing/>
         <w:rPr>
-          <w:rFonts w:asciiTheme="minorEastAsia" w:hAnsiTheme="minorEastAsia" w:hint="eastAsia"/>
+          <w:rFonts w:asciiTheme="minorEastAsia" w:hAnsiTheme="minorEastAsia"/>
           <w:color w:val="222222"/>
           <w:sz w:val="22"/>
           <w:szCs w:val="22"/>
@@ -1229,7 +1238,7 @@
         <w:ind w:left="0" w:rightChars="100" w:right="210" w:firstLineChars="0" w:firstLine="0"/>
         <w:contextualSpacing/>
         <w:rPr>
-          <w:rFonts w:asciiTheme="minorEastAsia" w:hAnsiTheme="minorEastAsia" w:hint="eastAsia"/>
+          <w:rFonts w:asciiTheme="minorEastAsia" w:hAnsiTheme="minorEastAsia"/>
           <w:color w:val="222222"/>
           <w:sz w:val="22"/>
           <w:szCs w:val="22"/>
@@ -1387,7 +1396,7 @@
         <w:ind w:left="0" w:rightChars="100" w:right="210" w:firstLineChars="0" w:firstLine="0"/>
         <w:contextualSpacing/>
         <w:rPr>
-          <w:rFonts w:asciiTheme="minorEastAsia" w:hAnsiTheme="minorEastAsia" w:hint="eastAsia"/>
+          <w:rFonts w:asciiTheme="minorEastAsia" w:hAnsiTheme="minorEastAsia"/>
           <w:color w:val="333333"/>
           <w:sz w:val="22"/>
           <w:szCs w:val="22"/>
@@ -1571,7 +1580,7 @@
         <w:ind w:rightChars="100" w:right="210"/>
         <w:contextualSpacing/>
         <w:rPr>
-          <w:rFonts w:asciiTheme="minorEastAsia" w:eastAsiaTheme="minorEastAsia" w:hAnsiTheme="minorEastAsia" w:hint="eastAsia"/>
+          <w:rFonts w:asciiTheme="minorEastAsia" w:eastAsiaTheme="minorEastAsia" w:hAnsiTheme="minorEastAsia"/>
           <w:sz w:val="22"/>
           <w:szCs w:val="22"/>
         </w:rPr>
@@ -1655,12 +1664,49 @@
         <w:ind w:left="0" w:rightChars="100" w:right="210" w:firstLineChars="0" w:firstLine="0"/>
         <w:contextualSpacing/>
         <w:rPr>
+          <w:rFonts w:asciiTheme="minorEastAsia" w:hAnsiTheme="minorEastAsia" w:cs="Arial"/>
+          <w:color w:val="222222"/>
+          <w:kern w:val="0"/>
+          <w:sz w:val="22"/>
+          <w:szCs w:val="22"/>
+        </w:rPr>
+      </w:pPr>
+      <w:r>
+        <w:rPr>
           <w:rFonts w:asciiTheme="minorEastAsia" w:hAnsiTheme="minorEastAsia" w:cs="Arial" w:hint="eastAsia"/>
           <w:color w:val="222222"/>
           <w:kern w:val="0"/>
           <w:sz w:val="22"/>
           <w:szCs w:val="22"/>
         </w:rPr>
+        <w:t>1947年，任《国语小报》社长和发行人。</w:t>
+      </w:r>
+    </w:p>
+    <w:p>
+      <w:pPr>
+        <w:spacing w:before="0" w:beforeAutospacing="0" w:line="240" w:lineRule="auto"/>
+        <w:ind w:left="0" w:rightChars="100" w:right="210" w:firstLineChars="0" w:firstLine="0"/>
+        <w:contextualSpacing/>
+        <w:rPr>
+          <w:rFonts w:asciiTheme="minorEastAsia" w:hAnsiTheme="minorEastAsia" w:cs="Arial"/>
+          <w:color w:val="222222"/>
+          <w:kern w:val="0"/>
+          <w:sz w:val="22"/>
+          <w:szCs w:val="22"/>
+        </w:rPr>
+      </w:pPr>
+    </w:p>
+    <w:p>
+      <w:pPr>
+        <w:spacing w:before="0" w:beforeAutospacing="0" w:line="240" w:lineRule="auto"/>
+        <w:ind w:left="0" w:rightChars="100" w:right="210" w:firstLineChars="0" w:firstLine="0"/>
+        <w:contextualSpacing/>
+        <w:rPr>
+          <w:rFonts w:asciiTheme="minorEastAsia" w:hAnsiTheme="minorEastAsia"/>
+          <w:color w:val="000000"/>
+          <w:sz w:val="22"/>
+          <w:szCs w:val="22"/>
+        </w:rPr>
       </w:pPr>
       <w:r>
         <w:rPr>
@@ -1670,94 +1716,66 @@
           <w:sz w:val="22"/>
           <w:szCs w:val="22"/>
         </w:rPr>
-        <w:t>1947年，任《国语小报》社长和发行人。</w:t>
-      </w:r>
-    </w:p>
-    <w:p>
-      <w:pPr>
-        <w:spacing w:before="0" w:beforeAutospacing="0" w:line="240" w:lineRule="auto"/>
-        <w:ind w:left="0" w:rightChars="100" w:right="210" w:firstLineChars="0" w:firstLine="0"/>
-        <w:contextualSpacing/>
-        <w:rPr>
-          <w:rFonts w:asciiTheme="minorEastAsia" w:hAnsiTheme="minorEastAsia" w:cs="Arial"/>
+        <w:t>1950年12月，</w:t>
+      </w:r>
+      <w:r>
+        <w:rPr>
+          <w:rFonts w:asciiTheme="minorEastAsia" w:hAnsiTheme="minorEastAsia" w:cs="Arial" w:hint="eastAsia"/>
           <w:color w:val="222222"/>
           <w:kern w:val="0"/>
           <w:sz w:val="22"/>
           <w:szCs w:val="22"/>
         </w:rPr>
-      </w:pPr>
-    </w:p>
-    <w:p>
-      <w:pPr>
-        <w:spacing w:before="0" w:beforeAutospacing="0" w:line="240" w:lineRule="auto"/>
-        <w:ind w:left="0" w:rightChars="100" w:right="210" w:firstLineChars="0" w:firstLine="0"/>
-        <w:contextualSpacing/>
+        <w:t>萧家霖</w:t>
+      </w:r>
+      <w:r>
+        <w:rPr>
+          <w:rFonts w:asciiTheme="minorEastAsia" w:hAnsiTheme="minorEastAsia" w:cs="Arial" w:hint="eastAsia"/>
+          <w:color w:val="222222"/>
+          <w:kern w:val="0"/>
+          <w:sz w:val="22"/>
+          <w:szCs w:val="22"/>
+        </w:rPr>
+        <w:t>任职于</w:t>
+      </w:r>
+      <w:r>
+        <w:rPr>
+          <w:rFonts w:asciiTheme="minorEastAsia" w:hAnsiTheme="minorEastAsia" w:cs="Arial" w:hint="eastAsia"/>
+          <w:color w:val="222222"/>
+          <w:kern w:val="0"/>
+          <w:sz w:val="22"/>
+          <w:szCs w:val="22"/>
+        </w:rPr>
+        <w:t>人民教育出版社</w:t>
+      </w:r>
+      <w:r>
+        <w:rPr>
+          <w:rFonts w:asciiTheme="minorEastAsia" w:hAnsiTheme="minorEastAsia" w:cs="Arial" w:hint="eastAsia"/>
+          <w:color w:val="222222"/>
+          <w:kern w:val="0"/>
+          <w:sz w:val="22"/>
+          <w:szCs w:val="22"/>
+        </w:rPr>
+        <w:t>下属的</w:t>
+      </w:r>
+      <w:r>
+        <w:rPr>
+          <w:rFonts w:asciiTheme="minorEastAsia" w:hAnsiTheme="minorEastAsia" w:cs="Arial" w:hint="eastAsia"/>
+          <w:color w:val="222222"/>
+          <w:kern w:val="0"/>
+          <w:sz w:val="22"/>
+          <w:szCs w:val="22"/>
+        </w:rPr>
+        <w:t>新华辞书社务委员会委员，协助社长魏建功负责辞书社日常工作并着手</w:t>
+      </w:r>
+      <w:r>
         <w:rPr>
           <w:rFonts w:asciiTheme="minorEastAsia" w:hAnsiTheme="minorEastAsia" w:hint="eastAsia"/>
           <w:color w:val="000000"/>
           <w:sz w:val="22"/>
           <w:szCs w:val="22"/>
         </w:rPr>
-      </w:pPr>
-      <w:r>
-        <w:rPr>
-          <w:rFonts w:asciiTheme="minorEastAsia" w:hAnsiTheme="minorEastAsia" w:cs="Arial" w:hint="eastAsia"/>
-          <w:color w:val="222222"/>
-          <w:kern w:val="0"/>
-          <w:sz w:val="22"/>
-          <w:szCs w:val="22"/>
-        </w:rPr>
-        <w:t>1950年12月，</w:t>
-      </w:r>
-      <w:r>
-        <w:rPr>
-          <w:rFonts w:asciiTheme="minorEastAsia" w:hAnsiTheme="minorEastAsia" w:cs="Arial" w:hint="eastAsia"/>
-          <w:color w:val="222222"/>
-          <w:kern w:val="0"/>
-          <w:sz w:val="22"/>
-          <w:szCs w:val="22"/>
-        </w:rPr>
-        <w:t>萧家霖</w:t>
-      </w:r>
-      <w:r>
-        <w:rPr>
-          <w:rFonts w:asciiTheme="minorEastAsia" w:hAnsiTheme="minorEastAsia" w:cs="Arial" w:hint="eastAsia"/>
-          <w:color w:val="222222"/>
-          <w:kern w:val="0"/>
-          <w:sz w:val="22"/>
-          <w:szCs w:val="22"/>
-        </w:rPr>
-        <w:t>任职于</w:t>
-      </w:r>
-      <w:r>
-        <w:rPr>
-          <w:rFonts w:asciiTheme="minorEastAsia" w:hAnsiTheme="minorEastAsia" w:cs="Arial" w:hint="eastAsia"/>
-          <w:color w:val="222222"/>
-          <w:kern w:val="0"/>
-          <w:sz w:val="22"/>
-          <w:szCs w:val="22"/>
-        </w:rPr>
-        <w:t>人民教育出版社</w:t>
-      </w:r>
-      <w:r>
-        <w:rPr>
-          <w:rFonts w:asciiTheme="minorEastAsia" w:hAnsiTheme="minorEastAsia" w:cs="Arial" w:hint="eastAsia"/>
-          <w:color w:val="222222"/>
-          <w:kern w:val="0"/>
-          <w:sz w:val="22"/>
-          <w:szCs w:val="22"/>
-        </w:rPr>
-        <w:t>下属的</w:t>
-      </w:r>
-      <w:r>
-        <w:rPr>
-          <w:rFonts w:asciiTheme="minorEastAsia" w:hAnsiTheme="minorEastAsia" w:cs="Arial" w:hint="eastAsia"/>
-          <w:color w:val="222222"/>
-          <w:kern w:val="0"/>
-          <w:sz w:val="22"/>
-          <w:szCs w:val="22"/>
-        </w:rPr>
-        <w:t>新华辞书社务委员会委员，协助社长魏建功负责辞书社日常工作并着手</w:t>
+        <w:t>部首排列的《新华字典》编纂工作</w:t>
       </w:r>
       <w:r>
         <w:rPr>
@@ -1766,7 +1784,7 @@
           <w:sz w:val="22"/>
           <w:szCs w:val="22"/>
         </w:rPr>
-        <w:t>部首排列的《新华字典》编纂工作</w:t>
+        <w:t>。</w:t>
       </w:r>
       <w:r>
         <w:rPr>
@@ -1775,6 +1793,194 @@
           <w:sz w:val="22"/>
           <w:szCs w:val="22"/>
         </w:rPr>
+        <w:t>1954年11月，</w:t>
+      </w:r>
+      <w:r>
+        <w:rPr>
+          <w:rFonts w:asciiTheme="minorEastAsia" w:hAnsiTheme="minorEastAsia" w:hint="eastAsia"/>
+          <w:color w:val="000000"/>
+          <w:sz w:val="22"/>
+          <w:szCs w:val="22"/>
+        </w:rPr>
+        <w:t>该</w:t>
+      </w:r>
+      <w:r>
+        <w:rPr>
+          <w:rFonts w:asciiTheme="minorEastAsia" w:hAnsiTheme="minorEastAsia" w:hint="eastAsia"/>
+          <w:color w:val="000000"/>
+          <w:sz w:val="22"/>
+          <w:szCs w:val="22"/>
+        </w:rPr>
+        <w:t>版本的《新华字典》</w:t>
+      </w:r>
+      <w:r>
+        <w:rPr>
+          <w:rFonts w:asciiTheme="minorEastAsia" w:hAnsiTheme="minorEastAsia" w:hint="eastAsia"/>
+          <w:color w:val="000000"/>
+          <w:sz w:val="22"/>
+          <w:szCs w:val="22"/>
+        </w:rPr>
+        <w:t>正式</w:t>
+      </w:r>
+      <w:r>
+        <w:rPr>
+          <w:rFonts w:asciiTheme="minorEastAsia" w:hAnsiTheme="minorEastAsia" w:hint="eastAsia"/>
+          <w:color w:val="000000"/>
+          <w:sz w:val="22"/>
+          <w:szCs w:val="22"/>
+        </w:rPr>
+        <w:t>出版。</w:t>
+      </w:r>
+    </w:p>
+    <w:p>
+      <w:pPr>
+        <w:spacing w:before="0" w:beforeAutospacing="0" w:line="240" w:lineRule="auto"/>
+        <w:ind w:left="0" w:rightChars="100" w:right="210" w:firstLineChars="0" w:firstLine="0"/>
+        <w:contextualSpacing/>
+        <w:rPr>
+          <w:rFonts w:asciiTheme="minorEastAsia" w:hAnsiTheme="minorEastAsia"/>
+          <w:color w:val="000000"/>
+          <w:sz w:val="22"/>
+          <w:szCs w:val="22"/>
+        </w:rPr>
+      </w:pPr>
+    </w:p>
+    <w:p>
+      <w:pPr>
+        <w:spacing w:before="0" w:beforeAutospacing="0" w:line="240" w:lineRule="auto"/>
+        <w:ind w:left="0" w:rightChars="100" w:right="210" w:firstLineChars="0" w:firstLine="0"/>
+        <w:contextualSpacing/>
+        <w:rPr>
+          <w:rFonts w:asciiTheme="minorEastAsia" w:hAnsiTheme="minorEastAsia"/>
+          <w:color w:val="000000"/>
+          <w:sz w:val="22"/>
+          <w:szCs w:val="22"/>
+        </w:rPr>
+      </w:pPr>
+      <w:r>
+        <w:rPr>
+          <w:rFonts w:asciiTheme="minorEastAsia" w:hAnsiTheme="minorEastAsia" w:hint="eastAsia"/>
+          <w:color w:val="000000"/>
+          <w:sz w:val="22"/>
+          <w:szCs w:val="22"/>
+        </w:rPr>
+        <w:t>1954年12月1日，辞书编辑室（</w:t>
+      </w:r>
+      <w:r>
+        <w:rPr>
+          <w:rFonts w:asciiTheme="minorEastAsia" w:hAnsiTheme="minorEastAsia" w:hint="eastAsia"/>
+          <w:color w:val="000000"/>
+          <w:sz w:val="22"/>
+          <w:szCs w:val="22"/>
+        </w:rPr>
+        <w:t>原</w:t>
+      </w:r>
+      <w:r>
+        <w:rPr>
+          <w:rFonts w:asciiTheme="minorEastAsia" w:hAnsiTheme="minorEastAsia" w:hint="eastAsia"/>
+          <w:color w:val="000000"/>
+          <w:sz w:val="22"/>
+          <w:szCs w:val="22"/>
+        </w:rPr>
+        <w:t>新华辞书社）整体划归文化部出版局管辖的古籍出版社。</w:t>
+      </w:r>
+    </w:p>
+    <w:p>
+      <w:pPr>
+        <w:spacing w:before="0" w:beforeAutospacing="0" w:line="240" w:lineRule="auto"/>
+        <w:ind w:left="0" w:rightChars="100" w:right="210" w:firstLineChars="0" w:firstLine="0"/>
+        <w:contextualSpacing/>
+        <w:rPr>
+          <w:rFonts w:asciiTheme="minorEastAsia" w:hAnsiTheme="minorEastAsia"/>
+          <w:color w:val="000000"/>
+          <w:sz w:val="22"/>
+          <w:szCs w:val="22"/>
+        </w:rPr>
+      </w:pPr>
+    </w:p>
+    <w:p>
+      <w:pPr>
+        <w:spacing w:before="0" w:beforeAutospacing="0" w:line="240" w:lineRule="auto"/>
+        <w:ind w:left="0" w:rightChars="100" w:right="210" w:firstLineChars="0" w:firstLine="0"/>
+        <w:contextualSpacing/>
+        <w:rPr>
+          <w:rStyle w:val="apple-converted-space"/>
+          <w:rFonts w:asciiTheme="minorEastAsia" w:hAnsiTheme="minorEastAsia"/>
+          <w:color w:val="000000"/>
+          <w:sz w:val="22"/>
+          <w:szCs w:val="22"/>
+        </w:rPr>
+      </w:pPr>
+      <w:r>
+        <w:rPr>
+          <w:rFonts w:asciiTheme="minorEastAsia" w:hAnsiTheme="minorEastAsia" w:hint="eastAsia"/>
+          <w:color w:val="000000"/>
+          <w:sz w:val="22"/>
+          <w:szCs w:val="22"/>
+        </w:rPr>
+        <w:t>1956年7月1日，辞书编辑室并入中科院语言研究所，与中国大辞典编纂处的编辑人员和语言所部分人员一起组建了词典编辑室</w:t>
+      </w:r>
+      <w:r>
+        <w:rPr>
+          <w:rFonts w:asciiTheme="minorEastAsia" w:hAnsiTheme="minorEastAsia" w:hint="eastAsia"/>
+          <w:color w:val="000000"/>
+          <w:sz w:val="22"/>
+          <w:szCs w:val="22"/>
+        </w:rPr>
+        <w:t>。萧家霖等</w:t>
+      </w:r>
+      <w:r>
+        <w:rPr>
+          <w:rFonts w:asciiTheme="minorEastAsia" w:hAnsiTheme="minorEastAsia" w:hint="eastAsia"/>
+          <w:color w:val="000000"/>
+          <w:sz w:val="22"/>
+          <w:szCs w:val="22"/>
+        </w:rPr>
+        <w:t>成为</w:t>
+      </w:r>
+      <w:r>
+        <w:rPr>
+          <w:rFonts w:asciiTheme="minorEastAsia" w:hAnsiTheme="minorEastAsia" w:hint="eastAsia"/>
+          <w:color w:val="000000"/>
+          <w:sz w:val="22"/>
+          <w:szCs w:val="22"/>
+        </w:rPr>
+        <w:t>《现代汉语词典》的</w:t>
+      </w:r>
+      <w:r>
+        <w:rPr>
+          <w:rFonts w:asciiTheme="minorEastAsia" w:hAnsiTheme="minorEastAsia" w:hint="eastAsia"/>
+          <w:color w:val="000000"/>
+          <w:sz w:val="22"/>
+          <w:szCs w:val="22"/>
+        </w:rPr>
+        <w:t>主要</w:t>
+      </w:r>
+      <w:r>
+        <w:rPr>
+          <w:rFonts w:asciiTheme="minorEastAsia" w:hAnsiTheme="minorEastAsia" w:hint="eastAsia"/>
+          <w:color w:val="000000"/>
+          <w:sz w:val="22"/>
+          <w:szCs w:val="22"/>
+        </w:rPr>
+        <w:t>编纂</w:t>
+      </w:r>
+      <w:r>
+        <w:rPr>
+          <w:rFonts w:asciiTheme="minorEastAsia" w:hAnsiTheme="minorEastAsia" w:hint="eastAsia"/>
+          <w:color w:val="000000"/>
+          <w:sz w:val="22"/>
+          <w:szCs w:val="22"/>
+        </w:rPr>
+        <w:t>人</w:t>
+      </w:r>
+      <w:r>
+        <w:rPr>
+          <w:rFonts w:asciiTheme="minorEastAsia" w:hAnsiTheme="minorEastAsia" w:hint="eastAsia"/>
+          <w:color w:val="000000"/>
+          <w:sz w:val="22"/>
+          <w:szCs w:val="22"/>
+        </w:rPr>
         <w:t>。</w:t>
       </w:r>
       <w:r>
@@ -1784,7 +1990,7 @@
           <w:sz w:val="22"/>
           <w:szCs w:val="22"/>
         </w:rPr>
-        <w:t>1954年11月，</w:t>
+        <w:t>之</w:t>
       </w:r>
       <w:r>
         <w:rPr>
@@ -1793,203 +1999,6 @@
           <w:sz w:val="22"/>
           <w:szCs w:val="22"/>
         </w:rPr>
-        <w:t>该</w:t>
-      </w:r>
-      <w:r>
-        <w:rPr>
-          <w:rFonts w:asciiTheme="minorEastAsia" w:hAnsiTheme="minorEastAsia" w:hint="eastAsia"/>
-          <w:color w:val="000000"/>
-          <w:sz w:val="22"/>
-          <w:szCs w:val="22"/>
-        </w:rPr>
-        <w:t>版本的《新华字典》</w:t>
-      </w:r>
-      <w:r>
-        <w:rPr>
-          <w:rFonts w:asciiTheme="minorEastAsia" w:hAnsiTheme="minorEastAsia" w:hint="eastAsia"/>
-          <w:color w:val="000000"/>
-          <w:sz w:val="22"/>
-          <w:szCs w:val="22"/>
-        </w:rPr>
-        <w:t>正式</w:t>
-      </w:r>
-      <w:r>
-        <w:rPr>
-          <w:rFonts w:asciiTheme="minorEastAsia" w:hAnsiTheme="minorEastAsia" w:hint="eastAsia"/>
-          <w:color w:val="000000"/>
-          <w:sz w:val="22"/>
-          <w:szCs w:val="22"/>
-        </w:rPr>
-        <w:t>出版。</w:t>
-      </w:r>
-    </w:p>
-    <w:p>
-      <w:pPr>
-        <w:spacing w:before="0" w:beforeAutospacing="0" w:line="240" w:lineRule="auto"/>
-        <w:ind w:left="0" w:rightChars="100" w:right="210" w:firstLineChars="0" w:firstLine="0"/>
-        <w:contextualSpacing/>
-        <w:rPr>
-          <w:rFonts w:asciiTheme="minorEastAsia" w:hAnsiTheme="minorEastAsia"/>
-          <w:color w:val="000000"/>
-          <w:sz w:val="22"/>
-          <w:szCs w:val="22"/>
-        </w:rPr>
-      </w:pPr>
-    </w:p>
-    <w:p>
-      <w:pPr>
-        <w:spacing w:before="0" w:beforeAutospacing="0" w:line="240" w:lineRule="auto"/>
-        <w:ind w:left="0" w:rightChars="100" w:right="210" w:firstLineChars="0" w:firstLine="0"/>
-        <w:contextualSpacing/>
-        <w:rPr>
-          <w:rFonts w:asciiTheme="minorEastAsia" w:hAnsiTheme="minorEastAsia" w:hint="eastAsia"/>
-          <w:color w:val="000000"/>
-          <w:sz w:val="22"/>
-          <w:szCs w:val="22"/>
-        </w:rPr>
-      </w:pPr>
-      <w:r>
-        <w:rPr>
-          <w:rFonts w:asciiTheme="minorEastAsia" w:hAnsiTheme="minorEastAsia" w:hint="eastAsia"/>
-          <w:color w:val="000000"/>
-          <w:sz w:val="22"/>
-          <w:szCs w:val="22"/>
-        </w:rPr>
-        <w:t>1954年12月1日，辞书编辑室（</w:t>
-      </w:r>
-      <w:r>
-        <w:rPr>
-          <w:rFonts w:asciiTheme="minorEastAsia" w:hAnsiTheme="minorEastAsia" w:hint="eastAsia"/>
-          <w:color w:val="000000"/>
-          <w:sz w:val="22"/>
-          <w:szCs w:val="22"/>
-        </w:rPr>
-        <w:t>原</w:t>
-      </w:r>
-      <w:r>
-        <w:rPr>
-          <w:rFonts w:asciiTheme="minorEastAsia" w:hAnsiTheme="minorEastAsia" w:hint="eastAsia"/>
-          <w:color w:val="000000"/>
-          <w:sz w:val="22"/>
-          <w:szCs w:val="22"/>
-        </w:rPr>
-        <w:t>新华辞书社）整体划归文化部出版局管辖的古籍出版社。</w:t>
-      </w:r>
-    </w:p>
-    <w:p>
-      <w:pPr>
-        <w:spacing w:before="0" w:beforeAutospacing="0" w:line="240" w:lineRule="auto"/>
-        <w:ind w:left="0" w:rightChars="100" w:right="210" w:firstLineChars="0" w:firstLine="0"/>
-        <w:contextualSpacing/>
-        <w:rPr>
-          <w:rFonts w:asciiTheme="minorEastAsia" w:hAnsiTheme="minorEastAsia"/>
-          <w:color w:val="000000"/>
-          <w:sz w:val="22"/>
-          <w:szCs w:val="22"/>
-        </w:rPr>
-      </w:pPr>
-    </w:p>
-    <w:p>
-      <w:pPr>
-        <w:spacing w:before="0" w:beforeAutospacing="0" w:line="240" w:lineRule="auto"/>
-        <w:ind w:left="0" w:rightChars="100" w:right="210" w:firstLineChars="0" w:firstLine="0"/>
-        <w:contextualSpacing/>
-        <w:rPr>
-          <w:rStyle w:val="apple-converted-space"/>
-          <w:rFonts w:asciiTheme="minorEastAsia" w:hAnsiTheme="minorEastAsia" w:hint="eastAsia"/>
-          <w:color w:val="000000"/>
-          <w:sz w:val="22"/>
-          <w:szCs w:val="22"/>
-        </w:rPr>
-      </w:pPr>
-      <w:r>
-        <w:rPr>
-          <w:rFonts w:asciiTheme="minorEastAsia" w:hAnsiTheme="minorEastAsia" w:hint="eastAsia"/>
-          <w:color w:val="000000"/>
-          <w:sz w:val="22"/>
-          <w:szCs w:val="22"/>
-        </w:rPr>
-        <w:t>1956年7月1日，辞书编辑室并入中科院语言研究所，与中国大辞典编纂处的编辑人员和语言所部分人员一起组建了词典编辑室</w:t>
-      </w:r>
-      <w:r>
-        <w:rPr>
-          <w:rFonts w:asciiTheme="minorEastAsia" w:hAnsiTheme="minorEastAsia" w:hint="eastAsia"/>
-          <w:color w:val="000000"/>
-          <w:sz w:val="22"/>
-          <w:szCs w:val="22"/>
-        </w:rPr>
-        <w:t>。萧家霖等</w:t>
-      </w:r>
-      <w:r>
-        <w:rPr>
-          <w:rFonts w:asciiTheme="minorEastAsia" w:hAnsiTheme="minorEastAsia" w:hint="eastAsia"/>
-          <w:color w:val="000000"/>
-          <w:sz w:val="22"/>
-          <w:szCs w:val="22"/>
-        </w:rPr>
-        <w:t>成为</w:t>
-      </w:r>
-      <w:r>
-        <w:rPr>
-          <w:rFonts w:asciiTheme="minorEastAsia" w:hAnsiTheme="minorEastAsia" w:hint="eastAsia"/>
-          <w:color w:val="000000"/>
-          <w:sz w:val="22"/>
-          <w:szCs w:val="22"/>
-        </w:rPr>
-        <w:t>《现代汉语词典》的</w:t>
-      </w:r>
-      <w:r>
-        <w:rPr>
-          <w:rFonts w:asciiTheme="minorEastAsia" w:hAnsiTheme="minorEastAsia" w:hint="eastAsia"/>
-          <w:color w:val="000000"/>
-          <w:sz w:val="22"/>
-          <w:szCs w:val="22"/>
-        </w:rPr>
-        <w:t>主要</w:t>
-      </w:r>
-      <w:r>
-        <w:rPr>
-          <w:rFonts w:asciiTheme="minorEastAsia" w:hAnsiTheme="minorEastAsia" w:hint="eastAsia"/>
-          <w:color w:val="000000"/>
-          <w:sz w:val="22"/>
-          <w:szCs w:val="22"/>
-        </w:rPr>
-        <w:t>编纂</w:t>
-      </w:r>
-      <w:r>
-        <w:rPr>
-          <w:rFonts w:asciiTheme="minorEastAsia" w:hAnsiTheme="minorEastAsia" w:hint="eastAsia"/>
-          <w:color w:val="000000"/>
-          <w:sz w:val="22"/>
-          <w:szCs w:val="22"/>
-        </w:rPr>
-        <w:t>人</w:t>
-      </w:r>
-      <w:r>
-        <w:rPr>
-          <w:rFonts w:asciiTheme="minorEastAsia" w:hAnsiTheme="minorEastAsia" w:hint="eastAsia"/>
-          <w:color w:val="000000"/>
-          <w:sz w:val="22"/>
-          <w:szCs w:val="22"/>
-        </w:rPr>
-        <w:t>。</w:t>
-      </w:r>
-      <w:r>
-        <w:rPr>
-          <w:rFonts w:asciiTheme="minorEastAsia" w:hAnsiTheme="minorEastAsia" w:hint="eastAsia"/>
-          <w:color w:val="000000"/>
-          <w:sz w:val="22"/>
-          <w:szCs w:val="22"/>
-        </w:rPr>
-        <w:t>之</w:t>
-      </w:r>
-      <w:r>
-        <w:rPr>
-          <w:rFonts w:asciiTheme="minorEastAsia" w:hAnsiTheme="minorEastAsia" w:hint="eastAsia"/>
-          <w:color w:val="000000"/>
-          <w:sz w:val="22"/>
-          <w:szCs w:val="22"/>
-        </w:rPr>
         <w:t>后</w:t>
       </w:r>
       <w:r>
@@ -2022,7 +2031,7 @@
         <w:ind w:left="0" w:rightChars="100" w:right="210" w:firstLineChars="0" w:firstLine="0"/>
         <w:contextualSpacing/>
         <w:rPr>
-          <w:rFonts w:asciiTheme="minorEastAsia" w:hAnsiTheme="minorEastAsia" w:hint="eastAsia"/>
+          <w:rFonts w:asciiTheme="minorEastAsia" w:hAnsiTheme="minorEastAsia"/>
           <w:color w:val="222222"/>
           <w:sz w:val="22"/>
           <w:szCs w:val="22"/>
@@ -2056,7 +2065,7 @@
         <w:ind w:left="0" w:rightChars="100" w:right="210" w:firstLineChars="0" w:firstLine="0"/>
         <w:contextualSpacing/>
         <w:rPr>
-          <w:rFonts w:asciiTheme="minorEastAsia" w:hAnsiTheme="minorEastAsia" w:hint="eastAsia"/>
+          <w:rFonts w:asciiTheme="minorEastAsia" w:hAnsiTheme="minorEastAsia"/>
           <w:color w:val="222222"/>
           <w:sz w:val="22"/>
           <w:szCs w:val="22"/>
@@ -2100,7 +2109,7 @@
         <w:ind w:left="0" w:rightChars="100" w:right="210" w:firstLineChars="0" w:firstLine="0"/>
         <w:contextualSpacing/>
         <w:rPr>
-          <w:rFonts w:asciiTheme="minorEastAsia" w:hAnsiTheme="minorEastAsia" w:hint="eastAsia"/>
+          <w:rFonts w:asciiTheme="minorEastAsia" w:hAnsiTheme="minorEastAsia"/>
           <w:color w:val="222222"/>
           <w:sz w:val="22"/>
           <w:szCs w:val="22"/>
@@ -2144,7 +2153,7 @@
         <w:ind w:left="0" w:rightChars="100" w:right="210" w:firstLineChars="0" w:firstLine="0"/>
         <w:contextualSpacing/>
         <w:rPr>
-          <w:rFonts w:asciiTheme="minorEastAsia" w:hAnsiTheme="minorEastAsia" w:hint="eastAsia"/>
+          <w:rFonts w:asciiTheme="minorEastAsia" w:hAnsiTheme="minorEastAsia"/>
           <w:color w:val="222222"/>
           <w:sz w:val="22"/>
           <w:szCs w:val="22"/>
@@ -2198,7 +2207,7 @@
         <w:ind w:left="0" w:rightChars="100" w:right="210" w:firstLineChars="0" w:firstLine="0"/>
         <w:contextualSpacing/>
         <w:rPr>
-          <w:rFonts w:asciiTheme="minorEastAsia" w:hAnsiTheme="minorEastAsia" w:hint="eastAsia"/>
+          <w:rFonts w:asciiTheme="minorEastAsia" w:hAnsiTheme="minorEastAsia"/>
           <w:color w:val="222222"/>
           <w:sz w:val="22"/>
           <w:szCs w:val="22"/>
@@ -2232,7 +2241,7 @@
         <w:ind w:left="0" w:rightChars="100" w:right="210" w:firstLineChars="0" w:firstLine="0"/>
         <w:contextualSpacing/>
         <w:rPr>
-          <w:rFonts w:asciiTheme="minorEastAsia" w:hAnsiTheme="minorEastAsia" w:hint="eastAsia"/>
+          <w:rFonts w:asciiTheme="minorEastAsia" w:hAnsiTheme="minorEastAsia"/>
           <w:color w:val="222222"/>
           <w:sz w:val="22"/>
           <w:szCs w:val="22"/>
@@ -2256,7 +2265,7 @@
         <w:ind w:left="0" w:rightChars="100" w:right="210" w:firstLineChars="0" w:firstLine="0"/>
         <w:contextualSpacing/>
         <w:rPr>
-          <w:rFonts w:asciiTheme="minorEastAsia" w:hAnsiTheme="minorEastAsia" w:hint="eastAsia"/>
+          <w:rFonts w:asciiTheme="minorEastAsia" w:hAnsiTheme="minorEastAsia"/>
           <w:color w:val="222222"/>
           <w:sz w:val="22"/>
           <w:szCs w:val="22"/>
@@ -2280,7 +2289,7 @@
         <w:ind w:left="0" w:rightChars="100" w:right="210" w:firstLineChars="0" w:firstLine="0"/>
         <w:contextualSpacing/>
         <w:rPr>
-          <w:rFonts w:asciiTheme="minorEastAsia" w:hAnsiTheme="minorEastAsia" w:hint="eastAsia"/>
+          <w:rFonts w:asciiTheme="minorEastAsia" w:hAnsiTheme="minorEastAsia"/>
           <w:color w:val="222222"/>
           <w:sz w:val="22"/>
           <w:szCs w:val="22"/>
@@ -2304,7 +2313,7 @@
         <w:ind w:left="0" w:rightChars="100" w:right="210" w:firstLineChars="0" w:firstLine="0"/>
         <w:contextualSpacing/>
         <w:rPr>
-          <w:rFonts w:asciiTheme="minorEastAsia" w:hAnsiTheme="minorEastAsia" w:hint="eastAsia"/>
+          <w:rFonts w:asciiTheme="minorEastAsia" w:hAnsiTheme="minorEastAsia"/>
           <w:color w:val="222222"/>
           <w:sz w:val="22"/>
           <w:szCs w:val="22"/>
@@ -2328,7 +2337,7 @@
         <w:ind w:left="0" w:rightChars="100" w:right="210" w:firstLineChars="0" w:firstLine="0"/>
         <w:contextualSpacing/>
         <w:rPr>
-          <w:rFonts w:asciiTheme="minorEastAsia" w:hAnsiTheme="minorEastAsia" w:hint="eastAsia"/>
+          <w:rFonts w:asciiTheme="minorEastAsia" w:hAnsiTheme="minorEastAsia"/>
           <w:color w:val="222222"/>
           <w:sz w:val="22"/>
           <w:szCs w:val="22"/>
@@ -2352,7 +2361,7 @@
         <w:ind w:left="0" w:rightChars="100" w:right="210" w:firstLineChars="0" w:firstLine="0"/>
         <w:contextualSpacing/>
         <w:rPr>
-          <w:rFonts w:asciiTheme="minorEastAsia" w:hAnsiTheme="minorEastAsia" w:hint="eastAsia"/>
+          <w:rFonts w:asciiTheme="minorEastAsia" w:hAnsiTheme="minorEastAsia"/>
           <w:color w:val="222222"/>
           <w:sz w:val="22"/>
           <w:szCs w:val="22"/>
@@ -2377,7 +2386,7 @@
         <w:ind w:left="0" w:rightChars="100" w:right="210" w:firstLineChars="0" w:firstLine="0"/>
         <w:contextualSpacing/>
         <w:rPr>
-          <w:rFonts w:asciiTheme="minorEastAsia" w:hAnsiTheme="minorEastAsia" w:hint="eastAsia"/>
+          <w:rFonts w:asciiTheme="minorEastAsia" w:hAnsiTheme="minorEastAsia"/>
           <w:color w:val="222222"/>
           <w:sz w:val="22"/>
           <w:szCs w:val="22"/>
@@ -2401,7 +2410,7 @@
         <w:ind w:left="0" w:rightChars="100" w:right="210" w:firstLineChars="0" w:firstLine="0"/>
         <w:contextualSpacing/>
         <w:rPr>
-          <w:rFonts w:asciiTheme="minorEastAsia" w:hAnsiTheme="minorEastAsia" w:hint="eastAsia"/>
+          <w:rFonts w:asciiTheme="minorEastAsia" w:hAnsiTheme="minorEastAsia"/>
           <w:color w:val="222222"/>
           <w:sz w:val="22"/>
           <w:szCs w:val="22"/>
@@ -2425,7 +2434,7 @@
         <w:ind w:left="0" w:rightChars="100" w:right="210" w:firstLineChars="0" w:firstLine="0"/>
         <w:contextualSpacing/>
         <w:rPr>
-          <w:rFonts w:asciiTheme="minorEastAsia" w:hAnsiTheme="minorEastAsia" w:hint="eastAsia"/>
+          <w:rFonts w:asciiTheme="minorEastAsia" w:hAnsiTheme="minorEastAsia"/>
           <w:color w:val="222222"/>
           <w:sz w:val="22"/>
           <w:szCs w:val="22"/>
@@ -2459,7 +2468,7 @@
         <w:ind w:left="0" w:rightChars="100" w:right="210" w:firstLineChars="0" w:firstLine="0"/>
         <w:contextualSpacing/>
         <w:rPr>
-          <w:rFonts w:asciiTheme="minorEastAsia" w:hAnsiTheme="minorEastAsia" w:hint="eastAsia"/>
+          <w:rFonts w:asciiTheme="minorEastAsia" w:hAnsiTheme="minorEastAsia"/>
           <w:color w:val="222222"/>
           <w:sz w:val="22"/>
           <w:szCs w:val="22"/>
@@ -2483,7 +2492,7 @@
         <w:ind w:left="0" w:rightChars="100" w:right="210" w:firstLineChars="0" w:firstLine="0"/>
         <w:contextualSpacing/>
         <w:rPr>
-          <w:rFonts w:asciiTheme="minorEastAsia" w:hAnsiTheme="minorEastAsia" w:hint="eastAsia"/>
+          <w:rFonts w:asciiTheme="minorEastAsia" w:hAnsiTheme="minorEastAsia"/>
           <w:color w:val="222222"/>
           <w:sz w:val="22"/>
           <w:szCs w:val="22"/>
@@ -2547,7 +2556,7 @@
         <w:ind w:left="0" w:rightChars="100" w:right="210" w:firstLineChars="0" w:firstLine="0"/>
         <w:contextualSpacing/>
         <w:rPr>
-          <w:rFonts w:asciiTheme="minorEastAsia" w:hAnsiTheme="minorEastAsia" w:hint="eastAsia"/>
+          <w:rFonts w:asciiTheme="minorEastAsia" w:hAnsiTheme="minorEastAsia"/>
           <w:color w:val="222222"/>
           <w:sz w:val="22"/>
           <w:szCs w:val="22"/>
@@ -2581,7 +2590,7 @@
         <w:ind w:left="0" w:rightChars="100" w:right="210" w:firstLineChars="0" w:firstLine="0"/>
         <w:contextualSpacing/>
         <w:rPr>
-          <w:rFonts w:asciiTheme="minorEastAsia" w:hAnsiTheme="minorEastAsia" w:hint="eastAsia"/>
+          <w:rFonts w:asciiTheme="minorEastAsia" w:hAnsiTheme="minorEastAsia"/>
           <w:color w:val="222222"/>
           <w:sz w:val="22"/>
           <w:szCs w:val="22"/>
@@ -2605,7 +2614,7 @@
         <w:ind w:left="0" w:rightChars="100" w:right="210" w:firstLineChars="0" w:firstLine="0"/>
         <w:contextualSpacing/>
         <w:rPr>
-          <w:rFonts w:asciiTheme="minorEastAsia" w:hAnsiTheme="minorEastAsia" w:hint="eastAsia"/>
+          <w:rFonts w:asciiTheme="minorEastAsia" w:hAnsiTheme="minorEastAsia"/>
           <w:color w:val="222222"/>
           <w:sz w:val="22"/>
           <w:szCs w:val="22"/>
@@ -2629,7 +2638,7 @@
         <w:ind w:left="0" w:rightChars="100" w:right="210" w:firstLineChars="0" w:firstLine="0"/>
         <w:contextualSpacing/>
         <w:rPr>
-          <w:rFonts w:asciiTheme="minorEastAsia" w:hAnsiTheme="minorEastAsia" w:hint="eastAsia"/>
+          <w:rFonts w:asciiTheme="minorEastAsia" w:hAnsiTheme="minorEastAsia"/>
           <w:color w:val="222222"/>
           <w:sz w:val="22"/>
           <w:szCs w:val="22"/>
@@ -2653,7 +2662,7 @@
         <w:ind w:left="0" w:rightChars="100" w:right="210" w:firstLineChars="0" w:firstLine="0"/>
         <w:contextualSpacing/>
         <w:rPr>
-          <w:rFonts w:asciiTheme="minorEastAsia" w:hAnsiTheme="minorEastAsia" w:hint="eastAsia"/>
+          <w:rFonts w:asciiTheme="minorEastAsia" w:hAnsiTheme="minorEastAsia"/>
           <w:color w:val="222222"/>
           <w:sz w:val="22"/>
           <w:szCs w:val="22"/>
@@ -2677,7 +2686,7 @@
         <w:ind w:left="0" w:rightChars="100" w:right="210" w:firstLineChars="0" w:firstLine="0"/>
         <w:contextualSpacing/>
         <w:rPr>
-          <w:rFonts w:asciiTheme="minorEastAsia" w:hAnsiTheme="minorEastAsia" w:hint="eastAsia"/>
+          <w:rFonts w:asciiTheme="minorEastAsia" w:hAnsiTheme="minorEastAsia"/>
           <w:color w:val="222222"/>
           <w:sz w:val="22"/>
           <w:szCs w:val="22"/>
@@ -2701,7 +2710,7 @@
         <w:ind w:left="0" w:rightChars="100" w:right="210" w:firstLineChars="0" w:firstLine="0"/>
         <w:contextualSpacing/>
         <w:rPr>
-          <w:rFonts w:asciiTheme="minorEastAsia" w:hAnsiTheme="minorEastAsia" w:hint="eastAsia"/>
+          <w:rFonts w:asciiTheme="minorEastAsia" w:hAnsiTheme="minorEastAsia"/>
           <w:color w:val="222222"/>
           <w:sz w:val="22"/>
           <w:szCs w:val="22"/>
@@ -2725,7 +2734,7 @@
         <w:ind w:left="0" w:rightChars="100" w:right="210" w:firstLineChars="0" w:firstLine="0"/>
         <w:contextualSpacing/>
         <w:rPr>
-          <w:rFonts w:asciiTheme="minorEastAsia" w:hAnsiTheme="minorEastAsia" w:hint="eastAsia"/>
+          <w:rFonts w:asciiTheme="minorEastAsia" w:hAnsiTheme="minorEastAsia"/>
           <w:color w:val="222222"/>
           <w:sz w:val="22"/>
           <w:szCs w:val="22"/>
@@ -2759,7 +2768,7 @@
         <w:ind w:left="0" w:rightChars="100" w:right="210" w:firstLineChars="0" w:firstLine="0"/>
         <w:contextualSpacing/>
         <w:rPr>
-          <w:rFonts w:asciiTheme="minorEastAsia" w:hAnsiTheme="minorEastAsia" w:hint="eastAsia"/>
+          <w:rFonts w:asciiTheme="minorEastAsia" w:hAnsiTheme="minorEastAsia"/>
           <w:color w:val="222222"/>
           <w:sz w:val="22"/>
           <w:szCs w:val="22"/>
@@ -2783,7 +2792,7 @@
         <w:ind w:left="0" w:rightChars="100" w:right="210" w:firstLineChars="0" w:firstLine="0"/>
         <w:contextualSpacing/>
         <w:rPr>
-          <w:rFonts w:asciiTheme="minorEastAsia" w:hAnsiTheme="minorEastAsia" w:hint="eastAsia"/>
+          <w:rFonts w:asciiTheme="minorEastAsia" w:hAnsiTheme="minorEastAsia"/>
           <w:color w:val="222222"/>
           <w:sz w:val="22"/>
           <w:szCs w:val="22"/>
@@ -2807,7 +2816,7 @@
         <w:ind w:left="0" w:rightChars="100" w:right="210" w:firstLineChars="0" w:firstLine="0"/>
         <w:contextualSpacing/>
         <w:rPr>
-          <w:rFonts w:asciiTheme="minorEastAsia" w:hAnsiTheme="minorEastAsia" w:hint="eastAsia"/>
+          <w:rFonts w:asciiTheme="minorEastAsia" w:hAnsiTheme="minorEastAsia"/>
           <w:color w:val="222222"/>
           <w:sz w:val="22"/>
           <w:szCs w:val="22"/>
@@ -2831,7 +2840,7 @@
         <w:ind w:left="0" w:rightChars="100" w:right="210" w:firstLineChars="0" w:firstLine="0"/>
         <w:contextualSpacing/>
         <w:rPr>
-          <w:rFonts w:asciiTheme="minorEastAsia" w:hAnsiTheme="minorEastAsia" w:hint="eastAsia"/>
+          <w:rFonts w:asciiTheme="minorEastAsia" w:hAnsiTheme="minorEastAsia"/>
           <w:color w:val="222222"/>
           <w:sz w:val="22"/>
           <w:szCs w:val="22"/>
@@ -2855,7 +2864,7 @@
         <w:ind w:left="0" w:rightChars="100" w:right="210" w:firstLineChars="0" w:firstLine="0"/>
         <w:contextualSpacing/>
         <w:rPr>
-          <w:rFonts w:asciiTheme="minorEastAsia" w:hAnsiTheme="minorEastAsia" w:hint="eastAsia"/>
+          <w:rFonts w:asciiTheme="minorEastAsia" w:hAnsiTheme="minorEastAsia"/>
           <w:color w:val="222222"/>
           <w:sz w:val="22"/>
           <w:szCs w:val="22"/>
@@ -2879,7 +2888,7 @@
         <w:ind w:left="0" w:rightChars="100" w:right="210" w:firstLineChars="0" w:firstLine="0"/>
         <w:contextualSpacing/>
         <w:rPr>
-          <w:rFonts w:asciiTheme="minorEastAsia" w:hAnsiTheme="minorEastAsia" w:hint="eastAsia"/>
+          <w:rFonts w:asciiTheme="minorEastAsia" w:hAnsiTheme="minorEastAsia"/>
           <w:color w:val="222222"/>
           <w:sz w:val="22"/>
           <w:szCs w:val="22"/>
@@ -2913,7 +2922,7 @@
         <w:ind w:left="0" w:rightChars="100" w:right="210" w:firstLineChars="0" w:firstLine="0"/>
         <w:contextualSpacing/>
         <w:rPr>
-          <w:rFonts w:asciiTheme="minorEastAsia" w:hAnsiTheme="minorEastAsia" w:hint="eastAsia"/>
+          <w:rFonts w:asciiTheme="minorEastAsia" w:hAnsiTheme="minorEastAsia"/>
           <w:color w:val="222222"/>
           <w:sz w:val="22"/>
           <w:szCs w:val="22"/>
@@ -2947,7 +2956,7 @@
         <w:ind w:left="0" w:rightChars="100" w:right="210" w:firstLineChars="0" w:firstLine="0"/>
         <w:contextualSpacing/>
         <w:rPr>
-          <w:rFonts w:asciiTheme="minorEastAsia" w:hAnsiTheme="minorEastAsia" w:hint="eastAsia"/>
+          <w:rFonts w:asciiTheme="minorEastAsia" w:hAnsiTheme="minorEastAsia"/>
           <w:color w:val="222222"/>
           <w:sz w:val="22"/>
           <w:szCs w:val="22"/>
@@ -2971,7 +2980,7 @@
         <w:ind w:left="0" w:rightChars="100" w:right="210" w:firstLineChars="0" w:firstLine="0"/>
         <w:contextualSpacing/>
         <w:rPr>
-          <w:rFonts w:asciiTheme="minorEastAsia" w:hAnsiTheme="minorEastAsia" w:hint="eastAsia"/>
+          <w:rFonts w:asciiTheme="minorEastAsia" w:hAnsiTheme="minorEastAsia"/>
           <w:color w:val="222222"/>
           <w:sz w:val="22"/>
           <w:szCs w:val="22"/>
@@ -2995,7 +3004,7 @@
         <w:ind w:left="0" w:rightChars="100" w:right="210" w:firstLineChars="0" w:firstLine="0"/>
         <w:contextualSpacing/>
         <w:rPr>
-          <w:rFonts w:asciiTheme="minorEastAsia" w:hAnsiTheme="minorEastAsia" w:hint="eastAsia"/>
+          <w:rFonts w:asciiTheme="minorEastAsia" w:hAnsiTheme="minorEastAsia"/>
           <w:color w:val="222222"/>
           <w:sz w:val="22"/>
           <w:szCs w:val="22"/>
@@ -3019,7 +3028,7 @@
         <w:ind w:left="0" w:rightChars="100" w:right="210" w:firstLineChars="0" w:firstLine="0"/>
         <w:contextualSpacing/>
         <w:rPr>
-          <w:rFonts w:asciiTheme="minorEastAsia" w:hAnsiTheme="minorEastAsia" w:hint="eastAsia"/>
+          <w:rFonts w:asciiTheme="minorEastAsia" w:hAnsiTheme="minorEastAsia"/>
           <w:color w:val="222222"/>
           <w:sz w:val="22"/>
           <w:szCs w:val="22"/>
@@ -3043,7 +3052,7 @@
         <w:ind w:left="0" w:rightChars="100" w:right="210" w:firstLineChars="0" w:firstLine="0"/>
         <w:contextualSpacing/>
         <w:rPr>
-          <w:rFonts w:asciiTheme="minorEastAsia" w:hAnsiTheme="minorEastAsia" w:hint="eastAsia"/>
+          <w:rFonts w:asciiTheme="minorEastAsia" w:hAnsiTheme="minorEastAsia"/>
           <w:color w:val="222222"/>
           <w:sz w:val="22"/>
           <w:szCs w:val="22"/>
@@ -3067,7 +3076,7 @@
         <w:ind w:left="0" w:rightChars="100" w:right="210" w:firstLineChars="0" w:firstLine="0"/>
         <w:contextualSpacing/>
         <w:rPr>
-          <w:rFonts w:asciiTheme="minorEastAsia" w:hAnsiTheme="minorEastAsia" w:hint="eastAsia"/>
+          <w:rFonts w:asciiTheme="minorEastAsia" w:hAnsiTheme="minorEastAsia"/>
           <w:color w:val="222222"/>
           <w:sz w:val="22"/>
           <w:szCs w:val="22"/>
@@ -3091,7 +3100,7 @@
         <w:ind w:left="0" w:rightChars="100" w:right="210" w:firstLineChars="0" w:firstLine="0"/>
         <w:contextualSpacing/>
         <w:rPr>
-          <w:rFonts w:asciiTheme="minorEastAsia" w:hAnsiTheme="minorEastAsia" w:hint="eastAsia"/>
+          <w:rFonts w:asciiTheme="minorEastAsia" w:hAnsiTheme="minorEastAsia"/>
           <w:color w:val="222222"/>
           <w:sz w:val="22"/>
           <w:szCs w:val="22"/>
@@ -3115,7 +3124,7 @@
         <w:ind w:left="0" w:rightChars="100" w:right="210" w:firstLineChars="0" w:firstLine="0"/>
         <w:contextualSpacing/>
         <w:rPr>
-          <w:rFonts w:asciiTheme="minorEastAsia" w:hAnsiTheme="minorEastAsia" w:hint="eastAsia"/>
+          <w:rFonts w:asciiTheme="minorEastAsia" w:hAnsiTheme="minorEastAsia"/>
           <w:color w:val="222222"/>
           <w:sz w:val="22"/>
           <w:szCs w:val="22"/>
@@ -3139,7 +3148,7 @@
         <w:ind w:left="0" w:rightChars="100" w:right="210" w:firstLineChars="0" w:firstLine="0"/>
         <w:contextualSpacing/>
         <w:rPr>
-          <w:rFonts w:asciiTheme="minorEastAsia" w:hAnsiTheme="minorEastAsia" w:hint="eastAsia"/>
+          <w:rFonts w:asciiTheme="minorEastAsia" w:hAnsiTheme="minorEastAsia"/>
           <w:color w:val="222222"/>
           <w:sz w:val="22"/>
           <w:szCs w:val="22"/>
@@ -3163,7 +3172,7 @@
         <w:ind w:left="0" w:rightChars="100" w:right="210" w:firstLineChars="0" w:firstLine="0"/>
         <w:contextualSpacing/>
         <w:rPr>
-          <w:rFonts w:asciiTheme="minorEastAsia" w:hAnsiTheme="minorEastAsia" w:hint="eastAsia"/>
+          <w:rFonts w:asciiTheme="minorEastAsia" w:hAnsiTheme="minorEastAsia"/>
           <w:color w:val="222222"/>
           <w:sz w:val="22"/>
           <w:szCs w:val="22"/>
@@ -3197,7 +3206,7 @@
         <w:ind w:left="0" w:rightChars="100" w:right="210" w:firstLineChars="0" w:firstLine="0"/>
         <w:contextualSpacing/>
         <w:rPr>
-          <w:rFonts w:asciiTheme="minorEastAsia" w:hAnsiTheme="minorEastAsia" w:hint="eastAsia"/>
+          <w:rFonts w:asciiTheme="minorEastAsia" w:hAnsiTheme="minorEastAsia"/>
           <w:color w:val="222222"/>
           <w:sz w:val="22"/>
           <w:szCs w:val="22"/>
@@ -3221,7 +3230,7 @@
         <w:ind w:left="0" w:rightChars="100" w:right="210" w:firstLineChars="0" w:firstLine="0"/>
         <w:contextualSpacing/>
         <w:rPr>
-          <w:rFonts w:asciiTheme="minorEastAsia" w:hAnsiTheme="minorEastAsia" w:hint="eastAsia"/>
+          <w:rFonts w:asciiTheme="minorEastAsia" w:hAnsiTheme="minorEastAsia"/>
           <w:color w:val="222222"/>
           <w:sz w:val="22"/>
           <w:szCs w:val="22"/>
@@ -3255,7 +3264,7 @@
         <w:ind w:left="0" w:rightChars="100" w:right="210" w:firstLineChars="0" w:firstLine="0"/>
         <w:contextualSpacing/>
         <w:rPr>
-          <w:rFonts w:asciiTheme="minorEastAsia" w:hAnsiTheme="minorEastAsia" w:hint="eastAsia"/>
+          <w:rFonts w:asciiTheme="minorEastAsia" w:hAnsiTheme="minorEastAsia"/>
           <w:color w:val="222222"/>
           <w:sz w:val="22"/>
           <w:szCs w:val="22"/>
@@ -3279,7 +3288,7 @@
         <w:ind w:left="0" w:rightChars="100" w:right="210" w:firstLineChars="0" w:firstLine="0"/>
         <w:contextualSpacing/>
         <w:rPr>
-          <w:rFonts w:asciiTheme="minorEastAsia" w:hAnsiTheme="minorEastAsia" w:hint="eastAsia"/>
+          <w:rFonts w:asciiTheme="minorEastAsia" w:hAnsiTheme="minorEastAsia"/>
           <w:color w:val="222222"/>
           <w:sz w:val="22"/>
           <w:szCs w:val="22"/>
@@ -3313,7 +3322,7 @@
         <w:ind w:left="0" w:rightChars="100" w:right="210" w:firstLineChars="0" w:firstLine="0"/>
         <w:contextualSpacing/>
         <w:rPr>
-          <w:rFonts w:asciiTheme="minorEastAsia" w:hAnsiTheme="minorEastAsia" w:hint="eastAsia"/>
+          <w:rFonts w:asciiTheme="minorEastAsia" w:hAnsiTheme="minorEastAsia"/>
           <w:color w:val="222222"/>
           <w:sz w:val="22"/>
           <w:szCs w:val="22"/>
@@ -3337,7 +3346,7 @@
         <w:ind w:left="0" w:rightChars="100" w:right="210" w:firstLineChars="0" w:firstLine="0"/>
         <w:contextualSpacing/>
         <w:rPr>
-          <w:rFonts w:asciiTheme="minorEastAsia" w:hAnsiTheme="minorEastAsia" w:hint="eastAsia"/>
+          <w:rFonts w:asciiTheme="minorEastAsia" w:hAnsiTheme="minorEastAsia"/>
           <w:color w:val="222222"/>
           <w:sz w:val="22"/>
           <w:szCs w:val="22"/>
@@ -3361,7 +3370,7 @@
         <w:ind w:left="0" w:rightChars="100" w:right="210" w:firstLineChars="0" w:firstLine="0"/>
         <w:contextualSpacing/>
         <w:rPr>
-          <w:rFonts w:asciiTheme="minorEastAsia" w:hAnsiTheme="minorEastAsia" w:hint="eastAsia"/>
+          <w:rFonts w:asciiTheme="minorEastAsia" w:hAnsiTheme="minorEastAsia"/>
           <w:color w:val="222222"/>
           <w:sz w:val="22"/>
           <w:szCs w:val="22"/>
@@ -3385,7 +3394,7 @@
         <w:ind w:left="0" w:rightChars="100" w:right="210" w:firstLineChars="0" w:firstLine="0"/>
         <w:contextualSpacing/>
         <w:rPr>
-          <w:rFonts w:asciiTheme="minorEastAsia" w:hAnsiTheme="minorEastAsia" w:hint="eastAsia"/>
+          <w:rFonts w:asciiTheme="minorEastAsia" w:hAnsiTheme="minorEastAsia"/>
           <w:color w:val="222222"/>
           <w:sz w:val="22"/>
           <w:szCs w:val="22"/>
@@ -3419,7 +3428,7 @@
         <w:ind w:left="0" w:rightChars="100" w:right="210" w:firstLineChars="0" w:firstLine="0"/>
         <w:contextualSpacing/>
         <w:rPr>
-          <w:rFonts w:asciiTheme="minorEastAsia" w:hAnsiTheme="minorEastAsia" w:hint="eastAsia"/>
+          <w:rFonts w:asciiTheme="minorEastAsia" w:hAnsiTheme="minorEastAsia"/>
           <w:color w:val="222222"/>
           <w:sz w:val="22"/>
           <w:szCs w:val="22"/>
@@ -3443,7 +3452,7 @@
         <w:ind w:left="0" w:rightChars="100" w:right="210" w:firstLineChars="0" w:firstLine="0"/>
         <w:contextualSpacing/>
         <w:rPr>
-          <w:rFonts w:asciiTheme="minorEastAsia" w:hAnsiTheme="minorEastAsia" w:hint="eastAsia"/>
+          <w:rFonts w:asciiTheme="minorEastAsia" w:hAnsiTheme="minorEastAsia"/>
           <w:color w:val="222222"/>
           <w:sz w:val="22"/>
           <w:szCs w:val="22"/>
@@ -3467,7 +3476,7 @@
         <w:ind w:left="0" w:rightChars="100" w:right="210" w:firstLineChars="0" w:firstLine="0"/>
         <w:contextualSpacing/>
         <w:rPr>
-          <w:rFonts w:asciiTheme="minorEastAsia" w:hAnsiTheme="minorEastAsia" w:hint="eastAsia"/>
+          <w:rFonts w:asciiTheme="minorEastAsia" w:hAnsiTheme="minorEastAsia"/>
           <w:color w:val="222222"/>
           <w:sz w:val="22"/>
           <w:szCs w:val="22"/>
@@ -3491,7 +3500,7 @@
         <w:ind w:left="0" w:rightChars="100" w:right="210" w:firstLineChars="0" w:firstLine="0"/>
         <w:contextualSpacing/>
         <w:rPr>
-          <w:rFonts w:asciiTheme="minorEastAsia" w:hAnsiTheme="minorEastAsia" w:hint="eastAsia"/>
+          <w:rFonts w:asciiTheme="minorEastAsia" w:hAnsiTheme="minorEastAsia"/>
           <w:color w:val="222222"/>
           <w:sz w:val="22"/>
           <w:szCs w:val="22"/>
@@ -3515,7 +3524,7 @@
         <w:ind w:left="0" w:rightChars="100" w:right="210" w:firstLineChars="0" w:firstLine="0"/>
         <w:contextualSpacing/>
         <w:rPr>
-          <w:rFonts w:asciiTheme="minorEastAsia" w:hAnsiTheme="minorEastAsia" w:hint="eastAsia"/>
+          <w:rFonts w:asciiTheme="minorEastAsia" w:hAnsiTheme="minorEastAsia"/>
           <w:color w:val="222222"/>
           <w:sz w:val="22"/>
           <w:szCs w:val="22"/>
@@ -3539,7 +3548,7 @@
         <w:ind w:left="0" w:rightChars="100" w:right="210" w:firstLineChars="0" w:firstLine="0"/>
         <w:contextualSpacing/>
         <w:rPr>
-          <w:rFonts w:asciiTheme="minorEastAsia" w:hAnsiTheme="minorEastAsia" w:hint="eastAsia"/>
+          <w:rFonts w:asciiTheme="minorEastAsia" w:hAnsiTheme="minorEastAsia"/>
           <w:color w:val="222222"/>
           <w:sz w:val="22"/>
           <w:szCs w:val="22"/>
@@ -3564,7 +3573,7 @@
         <w:ind w:left="0" w:rightChars="100" w:right="210" w:firstLineChars="0" w:firstLine="0"/>
         <w:contextualSpacing/>
         <w:rPr>
-          <w:rFonts w:asciiTheme="minorEastAsia" w:hAnsiTheme="minorEastAsia" w:hint="eastAsia"/>
+          <w:rFonts w:asciiTheme="minorEastAsia" w:hAnsiTheme="minorEastAsia"/>
           <w:color w:val="222222"/>
           <w:sz w:val="22"/>
           <w:szCs w:val="22"/>
@@ -3598,7 +3607,7 @@
         <w:ind w:left="0" w:rightChars="100" w:right="210" w:firstLineChars="0" w:firstLine="0"/>
         <w:contextualSpacing/>
         <w:rPr>
-          <w:rFonts w:asciiTheme="minorEastAsia" w:hAnsiTheme="minorEastAsia" w:hint="eastAsia"/>
+          <w:rFonts w:asciiTheme="minorEastAsia" w:hAnsiTheme="minorEastAsia"/>
           <w:color w:val="222222"/>
           <w:sz w:val="22"/>
           <w:szCs w:val="22"/>
@@ -3622,7 +3631,7 @@
         <w:ind w:left="0" w:rightChars="100" w:right="210" w:firstLineChars="0" w:firstLine="0"/>
         <w:contextualSpacing/>
         <w:rPr>
-          <w:rFonts w:asciiTheme="minorEastAsia" w:hAnsiTheme="minorEastAsia" w:hint="eastAsia"/>
+          <w:rFonts w:asciiTheme="minorEastAsia" w:hAnsiTheme="minorEastAsia"/>
           <w:color w:val="222222"/>
           <w:sz w:val="22"/>
           <w:szCs w:val="22"/>
@@ -3646,7 +3655,7 @@
         <w:ind w:left="0" w:rightChars="100" w:right="210" w:firstLineChars="0" w:firstLine="0"/>
         <w:contextualSpacing/>
         <w:rPr>
-          <w:rFonts w:asciiTheme="minorEastAsia" w:hAnsiTheme="minorEastAsia" w:hint="eastAsia"/>
+          <w:rFonts w:asciiTheme="minorEastAsia" w:hAnsiTheme="minorEastAsia"/>
           <w:color w:val="222222"/>
           <w:sz w:val="22"/>
           <w:szCs w:val="22"/>
@@ -3690,7 +3699,7 @@
         <w:ind w:left="0" w:rightChars="100" w:right="210" w:firstLineChars="0" w:firstLine="0"/>
         <w:contextualSpacing/>
         <w:rPr>
-          <w:rFonts w:asciiTheme="minorEastAsia" w:hAnsiTheme="minorEastAsia" w:hint="eastAsia"/>
+          <w:rFonts w:asciiTheme="minorEastAsia" w:hAnsiTheme="minorEastAsia"/>
           <w:color w:val="222222"/>
           <w:sz w:val="22"/>
           <w:szCs w:val="22"/>
@@ -3774,7 +3783,7 @@
         <w:ind w:left="0" w:rightChars="100" w:right="210" w:firstLineChars="0" w:firstLine="0"/>
         <w:contextualSpacing/>
         <w:rPr>
-          <w:rFonts w:asciiTheme="minorEastAsia" w:hAnsiTheme="minorEastAsia" w:hint="eastAsia"/>
+          <w:rFonts w:asciiTheme="minorEastAsia" w:hAnsiTheme="minorEastAsia"/>
           <w:color w:val="222222"/>
           <w:sz w:val="22"/>
           <w:szCs w:val="22"/>
@@ -3868,7 +3877,7 @@
         <w:ind w:left="0" w:rightChars="100" w:right="210" w:firstLineChars="0" w:firstLine="0"/>
         <w:contextualSpacing/>
         <w:rPr>
-          <w:rFonts w:asciiTheme="minorEastAsia" w:hAnsiTheme="minorEastAsia" w:hint="eastAsia"/>
+          <w:rFonts w:asciiTheme="minorEastAsia" w:hAnsiTheme="minorEastAsia"/>
           <w:color w:val="222222"/>
           <w:sz w:val="22"/>
           <w:szCs w:val="22"/>
@@ -3902,7 +3911,7 @@
         <w:ind w:left="0" w:rightChars="100" w:right="210" w:firstLineChars="0" w:firstLine="0"/>
         <w:contextualSpacing/>
         <w:rPr>
-          <w:rFonts w:asciiTheme="minorEastAsia" w:hAnsiTheme="minorEastAsia" w:hint="eastAsia"/>
+          <w:rFonts w:asciiTheme="minorEastAsia" w:hAnsiTheme="minorEastAsia"/>
           <w:color w:val="222222"/>
           <w:sz w:val="22"/>
           <w:szCs w:val="22"/>
@@ -3926,21 +3935,21 @@
         <w:ind w:left="0" w:rightChars="100" w:right="210" w:firstLineChars="0" w:firstLine="0"/>
         <w:contextualSpacing/>
         <w:rPr>
-          <w:rFonts w:asciiTheme="minorEastAsia" w:hAnsiTheme="minorEastAsia" w:hint="eastAsia"/>
-          <w:color w:val="222222"/>
-          <w:sz w:val="22"/>
-          <w:szCs w:val="22"/>
-          <w:shd w:val="clear" w:color="auto" w:fill="FFFFFF"/>
-        </w:rPr>
-      </w:pPr>
-    </w:p>
-    <w:p>
-      <w:pPr>
-        <w:spacing w:before="0" w:beforeAutospacing="0" w:line="240" w:lineRule="auto"/>
-        <w:ind w:left="0" w:rightChars="100" w:right="210" w:firstLineChars="0" w:firstLine="0"/>
-        <w:contextualSpacing/>
-        <w:rPr>
-          <w:rFonts w:asciiTheme="minorEastAsia" w:hAnsiTheme="minorEastAsia" w:hint="eastAsia"/>
+          <w:rFonts w:asciiTheme="minorEastAsia" w:hAnsiTheme="minorEastAsia"/>
+          <w:color w:val="222222"/>
+          <w:sz w:val="22"/>
+          <w:szCs w:val="22"/>
+          <w:shd w:val="clear" w:color="auto" w:fill="FFFFFF"/>
+        </w:rPr>
+      </w:pPr>
+    </w:p>
+    <w:p>
+      <w:pPr>
+        <w:spacing w:before="0" w:beforeAutospacing="0" w:line="240" w:lineRule="auto"/>
+        <w:ind w:left="0" w:rightChars="100" w:right="210" w:firstLineChars="0" w:firstLine="0"/>
+        <w:contextualSpacing/>
+        <w:rPr>
+          <w:rFonts w:asciiTheme="minorEastAsia" w:hAnsiTheme="minorEastAsia"/>
           <w:color w:val="222222"/>
           <w:sz w:val="22"/>
           <w:szCs w:val="22"/>
@@ -3963,6 +3972,15 @@
         <w:spacing w:before="0" w:beforeAutospacing="0" w:after="300" w:afterAutospacing="0" w:line="240" w:lineRule="auto"/>
         <w:ind w:left="0" w:rightChars="100" w:right="210" w:firstLineChars="0" w:firstLine="0"/>
         <w:contextualSpacing/>
+        <w:rPr>
+          <w:rFonts w:asciiTheme="minorEastAsia" w:hAnsiTheme="minorEastAsia" w:cs="Arial"/>
+          <w:color w:val="595757"/>
+          <w:kern w:val="0"/>
+          <w:sz w:val="22"/>
+          <w:szCs w:val="22"/>
+        </w:rPr>
+      </w:pPr>
+      <w:r>
         <w:rPr>
           <w:rFonts w:asciiTheme="minorEastAsia" w:hAnsiTheme="minorEastAsia" w:cs="Arial" w:hint="eastAsia"/>
           <w:color w:val="595757"/>
@@ -3970,6 +3988,21 @@
           <w:sz w:val="22"/>
           <w:szCs w:val="22"/>
         </w:rPr>
+        <w:t>《国音常用字汇》钱玄同主编，黎锦熙、白涤洲、萧家霖合编，赵元任、汪怡参订（1932年）</w:t>
+      </w:r>
+    </w:p>
+    <w:p>
+      <w:pPr>
+        <w:spacing w:before="0" w:beforeAutospacing="0" w:after="300" w:afterAutospacing="0" w:line="240" w:lineRule="auto"/>
+        <w:ind w:left="0" w:rightChars="100" w:right="210" w:firstLineChars="0" w:firstLine="0"/>
+        <w:contextualSpacing/>
+        <w:rPr>
+          <w:rFonts w:asciiTheme="minorEastAsia" w:hAnsiTheme="minorEastAsia" w:cs="Arial"/>
+          <w:color w:val="595757"/>
+          <w:kern w:val="0"/>
+          <w:sz w:val="22"/>
+          <w:szCs w:val="22"/>
+        </w:rPr>
       </w:pPr>
       <w:r>
         <w:rPr>
@@ -3979,14 +4012,9 @@
           <w:sz w:val="22"/>
           <w:szCs w:val="22"/>
         </w:rPr>
-        <w:t>《国音常用字汇》钱玄同主编，黎锦熙、白涤洲、萧家霖合编，赵元任、汪怡参订（1932年）</w:t>
-      </w:r>
-    </w:p>
-    <w:p>
-      <w:pPr>
-        <w:spacing w:before="0" w:beforeAutospacing="0" w:after="300" w:afterAutospacing="0" w:line="240" w:lineRule="auto"/>
-        <w:ind w:left="0" w:rightChars="100" w:right="210" w:firstLineChars="0" w:firstLine="0"/>
-        <w:contextualSpacing/>
+        <w:t>《民众辞典》萧家霖主编</w:t>
+      </w:r>
+      <w:r>
         <w:rPr>
           <w:rFonts w:asciiTheme="minorEastAsia" w:hAnsiTheme="minorEastAsia" w:cs="Arial" w:hint="eastAsia"/>
           <w:color w:val="595757"/>
@@ -3994,6 +4022,21 @@
           <w:sz w:val="22"/>
           <w:szCs w:val="22"/>
         </w:rPr>
+        <w:t>（1932年7月）</w:t>
+      </w:r>
+    </w:p>
+    <w:p>
+      <w:pPr>
+        <w:spacing w:before="0" w:beforeAutospacing="0" w:after="300" w:afterAutospacing="0" w:line="240" w:lineRule="auto"/>
+        <w:ind w:left="0" w:rightChars="100" w:right="210" w:firstLineChars="0" w:firstLine="0"/>
+        <w:contextualSpacing/>
+        <w:rPr>
+          <w:rFonts w:asciiTheme="minorEastAsia" w:hAnsiTheme="minorEastAsia" w:cs="Arial"/>
+          <w:color w:val="595757"/>
+          <w:kern w:val="0"/>
+          <w:sz w:val="22"/>
+          <w:szCs w:val="22"/>
+        </w:rPr>
       </w:pPr>
       <w:r>
         <w:rPr>
@@ -4003,7 +4046,7 @@
           <w:sz w:val="22"/>
           <w:szCs w:val="22"/>
         </w:rPr>
-        <w:t>《民众辞典》萧家霖主编</w:t>
+        <w:t>《中华新韵》魏建功、黎锦熙、卢前、萧家林编辑</w:t>
       </w:r>
       <w:r>
         <w:rPr>
@@ -4013,7 +4056,7 @@
           <w:sz w:val="22"/>
           <w:szCs w:val="22"/>
         </w:rPr>
-        <w:t>（1932年7月）</w:t>
+        <w:t>（1941年）</w:t>
       </w:r>
     </w:p>
     <w:p>
@@ -4021,6 +4064,15 @@
         <w:spacing w:before="0" w:beforeAutospacing="0" w:after="300" w:afterAutospacing="0" w:line="240" w:lineRule="auto"/>
         <w:ind w:left="0" w:rightChars="100" w:right="210" w:firstLineChars="0" w:firstLine="0"/>
         <w:contextualSpacing/>
+        <w:rPr>
+          <w:rFonts w:asciiTheme="minorEastAsia" w:hAnsiTheme="minorEastAsia" w:cs="Arial"/>
+          <w:color w:val="595757"/>
+          <w:kern w:val="0"/>
+          <w:sz w:val="22"/>
+          <w:szCs w:val="22"/>
+        </w:rPr>
+      </w:pPr>
+      <w:r>
         <w:rPr>
           <w:rFonts w:asciiTheme="minorEastAsia" w:hAnsiTheme="minorEastAsia" w:cs="Arial" w:hint="eastAsia"/>
           <w:color w:val="595757"/>
@@ -4028,7 +4080,8 @@
           <w:sz w:val="22"/>
           <w:szCs w:val="22"/>
         </w:rPr>
-      </w:pPr>
+        <w:t>《新华字典》（第一版）主要编纂人</w:t>
+      </w:r>
       <w:r>
         <w:rPr>
           <w:rFonts w:asciiTheme="minorEastAsia" w:hAnsiTheme="minorEastAsia" w:cs="Arial" w:hint="eastAsia"/>
@@ -4037,7 +4090,7 @@
           <w:sz w:val="22"/>
           <w:szCs w:val="22"/>
         </w:rPr>
-        <w:t>《中华新韵》魏建功、黎锦熙、卢前、萧家林编辑</w:t>
+        <w:t>（</w:t>
       </w:r>
       <w:r>
         <w:rPr>
@@ -4047,7 +4100,7 @@
           <w:sz w:val="22"/>
           <w:szCs w:val="22"/>
         </w:rPr>
-        <w:t>（1941年）</w:t>
+        <w:t>1954年）</w:t>
       </w:r>
     </w:p>
     <w:p>
@@ -4055,6 +4108,15 @@
         <w:spacing w:before="0" w:beforeAutospacing="0" w:after="300" w:afterAutospacing="0" w:line="240" w:lineRule="auto"/>
         <w:ind w:left="0" w:rightChars="100" w:right="210" w:firstLineChars="0" w:firstLine="0"/>
         <w:contextualSpacing/>
+        <w:rPr>
+          <w:rFonts w:asciiTheme="minorEastAsia" w:hAnsiTheme="minorEastAsia" w:cs="Arial"/>
+          <w:color w:val="595757"/>
+          <w:kern w:val="0"/>
+          <w:sz w:val="22"/>
+          <w:szCs w:val="22"/>
+        </w:rPr>
+      </w:pPr>
+      <w:r>
         <w:rPr>
           <w:rFonts w:asciiTheme="minorEastAsia" w:hAnsiTheme="minorEastAsia" w:cs="Arial" w:hint="eastAsia"/>
           <w:color w:val="595757"/>
@@ -4062,7 +4124,8 @@
           <w:sz w:val="22"/>
           <w:szCs w:val="22"/>
         </w:rPr>
-      </w:pPr>
+        <w:t>《现代汉语辞典》（试用版）</w:t>
+      </w:r>
       <w:r>
         <w:rPr>
           <w:rFonts w:asciiTheme="minorEastAsia" w:hAnsiTheme="minorEastAsia" w:cs="Arial" w:hint="eastAsia"/>
@@ -4071,7 +4134,7 @@
           <w:sz w:val="22"/>
           <w:szCs w:val="22"/>
         </w:rPr>
-        <w:t>《新华字典》（第一版）主要编纂人</w:t>
+        <w:t>主</w:t>
       </w:r>
       <w:r>
         <w:rPr>
@@ -4081,7 +4144,7 @@
           <w:sz w:val="22"/>
           <w:szCs w:val="22"/>
         </w:rPr>
-        <w:t>（</w:t>
+        <w:t>要编纂人</w:t>
       </w:r>
       <w:r>
         <w:rPr>
@@ -4091,60 +4154,6 @@
           <w:sz w:val="22"/>
           <w:szCs w:val="22"/>
         </w:rPr>
-        <w:t>1954年）</w:t>
-      </w:r>
-    </w:p>
-    <w:p>
-      <w:pPr>
-        <w:spacing w:before="0" w:beforeAutospacing="0" w:after="300" w:afterAutospacing="0" w:line="240" w:lineRule="auto"/>
-        <w:ind w:left="0" w:rightChars="100" w:right="210" w:firstLineChars="0" w:firstLine="0"/>
-        <w:contextualSpacing/>
-        <w:rPr>
-          <w:rFonts w:asciiTheme="minorEastAsia" w:hAnsiTheme="minorEastAsia" w:cs="Arial" w:hint="eastAsia"/>
-          <w:color w:val="595757"/>
-          <w:kern w:val="0"/>
-          <w:sz w:val="22"/>
-          <w:szCs w:val="22"/>
-        </w:rPr>
-      </w:pPr>
-      <w:r>
-        <w:rPr>
-          <w:rFonts w:asciiTheme="minorEastAsia" w:hAnsiTheme="minorEastAsia" w:cs="Arial" w:hint="eastAsia"/>
-          <w:color w:val="595757"/>
-          <w:kern w:val="0"/>
-          <w:sz w:val="22"/>
-          <w:szCs w:val="22"/>
-        </w:rPr>
-        <w:t>《现代汉语辞典》（试用版）</w:t>
-      </w:r>
-      <w:r>
-        <w:rPr>
-          <w:rFonts w:asciiTheme="minorEastAsia" w:hAnsiTheme="minorEastAsia" w:cs="Arial" w:hint="eastAsia"/>
-          <w:color w:val="595757"/>
-          <w:kern w:val="0"/>
-          <w:sz w:val="22"/>
-          <w:szCs w:val="22"/>
-        </w:rPr>
-        <w:t>主</w:t>
-      </w:r>
-      <w:r>
-        <w:rPr>
-          <w:rFonts w:asciiTheme="minorEastAsia" w:hAnsiTheme="minorEastAsia" w:cs="Arial" w:hint="eastAsia"/>
-          <w:color w:val="595757"/>
-          <w:kern w:val="0"/>
-          <w:sz w:val="22"/>
-          <w:szCs w:val="22"/>
-        </w:rPr>
-        <w:t>要编纂人</w:t>
-      </w:r>
-      <w:r>
-        <w:rPr>
-          <w:rFonts w:asciiTheme="minorEastAsia" w:hAnsiTheme="minorEastAsia" w:cs="Arial" w:hint="eastAsia"/>
-          <w:color w:val="595757"/>
-          <w:kern w:val="0"/>
-          <w:sz w:val="22"/>
-          <w:szCs w:val="22"/>
-        </w:rPr>
         <w:t>（1956年）</w:t>
       </w:r>
     </w:p>
@@ -4154,7 +4163,7 @@
         <w:ind w:left="0" w:rightChars="100" w:right="210" w:firstLineChars="0" w:firstLine="0"/>
         <w:contextualSpacing/>
         <w:rPr>
-          <w:rFonts w:asciiTheme="minorEastAsia" w:hAnsiTheme="minorEastAsia" w:hint="eastAsia"/>
+          <w:rFonts w:asciiTheme="minorEastAsia" w:hAnsiTheme="minorEastAsia"/>
           <w:color w:val="222222"/>
           <w:sz w:val="22"/>
           <w:szCs w:val="22"/>
@@ -4166,7 +4175,7 @@
       <w:pPr>
         <w:ind w:left="0" w:firstLineChars="0" w:firstLine="0"/>
         <w:rPr>
-          <w:rFonts w:asciiTheme="minorEastAsia" w:hAnsiTheme="minorEastAsia" w:hint="eastAsia"/>
+          <w:rFonts w:asciiTheme="minorEastAsia" w:hAnsiTheme="minorEastAsia"/>
           <w:color w:val="222222"/>
           <w:sz w:val="22"/>
           <w:szCs w:val="22"/>
@@ -4384,7 +4393,7 @@
       <w:pPr>
         <w:ind w:left="0" w:firstLineChars="0" w:firstLine="0"/>
         <w:rPr>
-          <w:rFonts w:asciiTheme="minorEastAsia" w:hAnsiTheme="minorEastAsia" w:hint="eastAsia"/>
+          <w:rFonts w:asciiTheme="minorEastAsia" w:hAnsiTheme="minorEastAsia"/>
           <w:color w:val="222222"/>
           <w:sz w:val="18"/>
           <w:szCs w:val="18"/>

</xml_diff>